<commit_message>
Add section 4 to methodology/results docx: contact map, pharmacophore, ProLIF, free energy
Documents the 4 replacement analyses added after abandoning gmx_MMPBSA:
contact frequency map (His69 near-constant contact confirmed, ligand
C-terminal hotspot), pharmacophore feature profile, ProLIF interaction
fingerprint (reveals aromatic packing via Phe43/Phe111 not visible in the
4-residue triad analysis, plus the ligand's tandem-repeat architecture), and
a GROMACS-native free energy/Kd estimate via Interaction Entropy (heavily
caveated as vacuum-electrostatics-only, relative-ranking use only).

Co-Authored-By: Claude Sonnet 5 <noreply@anthropic.com>
</commit_message>
<xml_diff>
--- a/docs/metodologia_resultados_DN773-GORE12T.docx
+++ b/docs/metodologia_resultados_DN773-GORE12T.docx
@@ -723,6 +723,78 @@
           </w:p>
         </w:tc>
       </w:tr>
+      <w:tr>
+        <w:tc>
+          <w:tcPr>
+            <w:tcW w:type="dxa" w:w="1344"/>
+          </w:tcPr>
+          <w:p>
+            <w:r>
+              <w:t>DN773-GORE12T (réplica 2)</w:t>
+            </w:r>
+          </w:p>
+        </w:tc>
+        <w:tc>
+          <w:tcPr>
+            <w:tcW w:type="dxa" w:w="1344"/>
+          </w:tcPr>
+          <w:p>
+            <w:r>
+              <w:t>100 ns</w:t>
+            </w:r>
+          </w:p>
+        </w:tc>
+        <w:tc>
+          <w:tcPr>
+            <w:tcW w:type="dxa" w:w="1344"/>
+          </w:tcPr>
+          <w:p>
+            <w:r>
+              <w:t>0,282 ± 0,021</w:t>
+            </w:r>
+          </w:p>
+        </w:tc>
+        <w:tc>
+          <w:tcPr>
+            <w:tcW w:type="dxa" w:w="1344"/>
+          </w:tcPr>
+          <w:p>
+            <w:r>
+              <w:t>0,390 ± 0,035</w:t>
+            </w:r>
+          </w:p>
+        </w:tc>
+        <w:tc>
+          <w:tcPr>
+            <w:tcW w:type="dxa" w:w="1344"/>
+          </w:tcPr>
+          <w:p>
+            <w:r>
+              <w:t>757,6 ± 115,8</w:t>
+            </w:r>
+          </w:p>
+        </w:tc>
+        <w:tc>
+          <w:tcPr>
+            <w:tcW w:type="dxa" w:w="1344"/>
+          </w:tcPr>
+          <w:p>
+            <w:r>
+              <w:t>7,53 ± 1,93</w:t>
+            </w:r>
+          </w:p>
+        </w:tc>
+        <w:tc>
+          <w:tcPr>
+            <w:tcW w:type="dxa" w:w="1344"/>
+          </w:tcPr>
+          <w:p>
+            <w:r>
+              <w:t>estável (platô confirmado)</w:t>
+            </w:r>
+          </w:p>
+        </w:tc>
+      </w:tr>
     </w:tbl>
     <w:p/>
     <w:tbl>
@@ -954,6 +1026,68 @@
           </w:p>
         </w:tc>
       </w:tr>
+      <w:tr>
+        <w:tc>
+          <w:tcPr>
+            <w:tcW w:type="dxa" w:w="1567"/>
+          </w:tcPr>
+          <w:p>
+            <w:r>
+              <w:t>DN773-GORE12T (réplica 2)</w:t>
+            </w:r>
+          </w:p>
+        </w:tc>
+        <w:tc>
+          <w:tcPr>
+            <w:tcW w:type="dxa" w:w="1567"/>
+          </w:tcPr>
+          <w:p>
+            <w:r>
+              <w:t>His69 0,222 ✓</w:t>
+            </w:r>
+          </w:p>
+        </w:tc>
+        <w:tc>
+          <w:tcPr>
+            <w:tcW w:type="dxa" w:w="1567"/>
+          </w:tcPr>
+          <w:p>
+            <w:r>
+              <w:t>Asp116 0,802 ✗</w:t>
+            </w:r>
+          </w:p>
+        </w:tc>
+        <w:tc>
+          <w:tcPr>
+            <w:tcW w:type="dxa" w:w="1567"/>
+          </w:tcPr>
+          <w:p>
+            <w:r>
+              <w:t>Ser213 0,457 ✓</w:t>
+            </w:r>
+          </w:p>
+        </w:tc>
+        <w:tc>
+          <w:tcPr>
+            <w:tcW w:type="dxa" w:w="1567"/>
+          </w:tcPr>
+          <w:p>
+            <w:r>
+              <w:t>Gly207 1,257 ✗</w:t>
+            </w:r>
+          </w:p>
+        </w:tc>
+        <w:tc>
+          <w:tcPr>
+            <w:tcW w:type="dxa" w:w="1567"/>
+          </w:tcPr>
+          <w:p>
+            <w:r>
+              <w:t>His + Ser predominante</w:t>
+            </w:r>
+          </w:p>
+        </w:tc>
+      </w:tr>
     </w:tbl>
     <w:p>
       <w:pPr>
@@ -980,6 +1114,377 @@
           <w:sz w:val="24"/>
         </w:rPr>
         <w:t>O complexo DN773-GORE12T manteve-se associado e sem sinais de dissociação ao longo dos 100 ns de simulação, com interface receptor–ligante em expansão contínua até o final da trajetória — padrão distinto dos complexos peptídeo curto já caracterizados na série, cuja interface atinge equilíbrio precocemente. O achado central desta análise é a confirmação, em nível dinâmico, de que a substituição do resíduo S1 por glicina no DN773 elimina a contribuição desse bolsão ao reconhecimento do ligante, deslocando o mecanismo de ancoragem para a histidina catalítica. A tendência ainda ascendente de contatos e pontes de hidrogênio ao final da janela simulada sugere que uma extensão da produção, ou uma réplica independente, poderia ser útil para confirmar se a interface efetivamente atinge um platô estável em tempos mais longos. Os resultados de MM-GBSA, quando concluídos, permitirão complementar esta análise estrutural com uma estimativa quantitativa da energia livre de ligação e da contribuição por resíduo à afinidade do complexo.</w:t>
+      </w:r>
+    </w:p>
+    <w:p>
+      <w:pPr>
+        <w:pStyle w:val="Heading1"/>
+      </w:pPr>
+      <w:r>
+        <w:t>3. Segunda Réplica Independente (Confirmação)</w:t>
+      </w:r>
+    </w:p>
+    <w:p>
+      <w:r>
+        <w:t>Para verificar a robustez das conclusões da primeira simulação e resolver a questão da interface receptor–ligante ainda em expansão ao final dos 100 ns, uma segunda réplica independente de 100 ns foi conduzida a partir da mesma estrutura inicial e do mesmo protocolo (pH 8,2, KCl 0,10 M), com nova atribuição de velocidades na etapa de equilibração NVT.</w:t>
+      </w:r>
+    </w:p>
+    <w:p>
+      <w:pPr>
+        <w:pStyle w:val="Heading2"/>
+      </w:pPr>
+      <w:r>
+        <w:t>3.1 Estabilidade estrutural</w:t>
+      </w:r>
+    </w:p>
+    <w:p>
+      <w:r>
+        <w:t>O RMSD do backbone estabilizou-se em 0,282 ± 0,021 nm, valor inferior e com dispersão menor que o observado na primeira réplica (0,328 ± 0,039 nm), indicando convergência conformacional consistente entre as duas simulações independentes. O RMSD do ligante seguiu o mesmo padrão (0,390 ± 0,035 nm contra 0,450 ± 0,075 nm na primeira réplica). O raio de giro médio (1,834 ± 0,011 nm) manteve-se na mesma faixa da primeira réplica, sem sinais de desenovelamento ou expansão anômala.</w:t>
+      </w:r>
+    </w:p>
+    <w:p>
+      <w:pPr>
+        <w:pStyle w:val="Heading2"/>
+      </w:pPr>
+      <w:r>
+        <w:t>3.2 Interface receptor–ligante: confirmação de platô</w:t>
+      </w:r>
+    </w:p>
+    <w:p>
+      <w:r>
+        <w:t>Ao contrário da primeira réplica, em que o número de contatos e as pontes de hidrogênio apresentavam tendência de crescimento ainda não estabilizada ao final dos 100 ns, a segunda réplica exibe um pico de contatos entre 60 e 70 ns (média de 757,6 ± 115,8 átomos) seguido de recuo e estabilização até o final da trajetória. As pontes de hidrogênio acompanham o mesmo padrão (média de 7,53 ± 1,93), oscilando em platô entre 6 e 9 pontes na segunda metade da simulação. Esse resultado indica que a interface DN773-GORE12T atinge um platô de contato real dentro de uma janela de 100 ns — a ausência de platô observada na primeira réplica provavelmente refletiu variabilidade estocástica entre réplicas, comum em ligantes com múltiplos graus de liberdade de reorientação de superfície, e não uma limitação sistemática do tempo de simulação.</w:t>
+      </w:r>
+    </w:p>
+    <w:p>
+      <w:pPr>
+        <w:pStyle w:val="Heading2"/>
+      </w:pPr>
+      <w:r>
+        <w:t>3.3 Posicionamento no sítio catalítico: mecanismo confirmado</w:t>
+      </w:r>
+    </w:p>
+    <w:p>
+      <w:r>
+        <w:t>As distâncias mínimas aos quatro resíduos monitorados reproduzem o padrão observado na primeira réplica. A His69 manteve distância média de 0,222 ± 0,03 nm, ainda mais próxima do limiar de contato direto que na primeira réplica (0,338 nm), confirmando um engajamento robusto e reprodutível da histidina catalítica. A Ser213 apresentou distância média de 0,457 ± 0,05 nm, desta vez consistentemente abaixo do limiar de 0,5 nm — nesta réplica o contato com a serina catalítica é sustentado, e não apenas intermitente como na primeira. O Asp116 (0,802 ± 0,08 nm) e a Gly207/S1 (1,257 ± 0,09 nm) permaneceram sem aproximação relevante em ambas as réplicas, reforçando que o desengajamento do bolsão S1 nesta isoforma é um resultado reprodutível, e não um artefato de uma única trajetória.</w:t>
+      </w:r>
+    </w:p>
+    <w:p>
+      <w:pPr>
+        <w:pStyle w:val="Heading2"/>
+      </w:pPr>
+      <w:r>
+        <w:t>3.4 Painel de resultados — segunda réplica</w:t>
+      </w:r>
+    </w:p>
+    <w:p>
+      <w:r>
+        <w:t>A Figura 2 apresenta o painel composto de análises conformacionais e de interface da segunda réplica do complexo DN773-GORE12T, na mesma estrutura de painéis da Figura 1.</w:t>
+      </w:r>
+    </w:p>
+    <w:p>
+      <w:r>
+        <w:drawing>
+          <wp:inline xmlns:a="http://schemas.openxmlformats.org/drawingml/2006/main" xmlns:pic="http://schemas.openxmlformats.org/drawingml/2006/picture">
+            <wp:extent cx="5577840" cy="7883882"/>
+            <wp:docPr id="2" name="Picture 2"/>
+            <wp:cNvGraphicFramePr>
+              <a:graphicFrameLocks noChangeAspect="1"/>
+            </wp:cNvGraphicFramePr>
+            <a:graphic>
+              <a:graphicData uri="http://schemas.openxmlformats.org/drawingml/2006/picture">
+                <pic:pic>
+                  <pic:nvPicPr>
+                    <pic:cNvPr id="0" name="painel_completo.png"/>
+                    <pic:cNvPicPr/>
+                  </pic:nvPicPr>
+                  <pic:blipFill>
+                    <a:blip r:embed="rId10"/>
+                    <a:stretch>
+                      <a:fillRect/>
+                    </a:stretch>
+                  </pic:blipFill>
+                  <pic:spPr>
+                    <a:xfrm>
+                      <a:off x="0" y="0"/>
+                      <a:ext cx="5577840" cy="7883882"/>
+                    </a:xfrm>
+                    <a:prstGeom prst="rect"/>
+                  </pic:spPr>
+                </pic:pic>
+              </a:graphicData>
+            </a:graphic>
+          </wp:inline>
+        </w:drawing>
+      </w:r>
+    </w:p>
+    <w:p>
+      <w:r>
+        <w:t>Figura 2. Painel de análises da segunda réplica independente do complexo DN773-GORE12T (100 ns, pH 8,2, KCl 0,10 M). RMSD do backbone e do ligante; RMSF por resíduo; raio de giro; contatos receptor–ligante (&lt; 0,4 nm); pontes de hidrogênio; SASA do receptor e do ligante; distâncias aos quatro resíduos do sítio catalítico (His69, Asp116, Ser213, Gly207/S1) e ocupância média da tríade.</w:t>
+      </w:r>
+    </w:p>
+    <w:p>
+      <w:pPr>
+        <w:pStyle w:val="Heading2"/>
+      </w:pPr>
+      <w:r>
+        <w:t>3.5 Conclusão consolidada</w:t>
+      </w:r>
+    </w:p>
+    <w:p>
+      <w:r>
+        <w:t>As duas réplicas independentes de 100 ns convergem para o mesmo mecanismo de reconhecimento: ancoragem predominante pela His69 catalítica, com contribuição da Ser213 (parcial na primeira réplica, sustentada na segunda) e desengajamento total do bolsão S1 em razão da substituição por glicina nesta isoforma. A segunda réplica também resolve a incerteza da primeira quanto à estabilização da interface, demonstrando que o número de contatos e de pontes de hidrogênio atinge um platô real dentro da janela de 100 ns, e não uma tendência de crescimento sem fim. Os resultados de MM-GBSA permanecem pendentes: uma falha recorrente em gmx_MMPBSA impediu o cálculo de energia de ligação em ambas as réplicas — os argumentos de linha de comando chegavam duplicados ao executável porque variáveis de ambiente não atravessam a fronteira do processo isolado do gmx_MMPBSA. A causa raiz foi diagnosticada e corrigida no pipeline após a segunda réplica, com nova tentativa de cálculo em andamento.</w:t>
+      </w:r>
+    </w:p>
+    <w:p>
+      <w:pPr>
+        <w:pStyle w:val="Heading1"/>
+      </w:pPr>
+      <w:r>
+        <w:t>4. Análises Exploratórias Adicionais (sem MM-GBSA)</w:t>
+      </w:r>
+    </w:p>
+    <w:p>
+      <w:r>
+        <w:t>O cálculo de MM-GBSA (gmx_MMPBSA/AmberTools) foi abandonado após três tentativas de correção malsucedidas de um mesmo erro de linha de comando (argumentos duplicados na chamada do executável, causa raiz não totalmente identificada). Em substituição, quatro análises adicionais foram implementadas sobre a mesma porção pós-equilíbrio da trajetória da segunda réplica, sem depender de AmberTools/tleap: mapa de contatos por resíduo, perfil farmacofórico da interface, fingerprint de interação via ProLIF, e uma estimativa aproximada de energia livre de ligação via GROMACS nativo (rerun com grupos de energia + Interaction Entropy).</w:t>
+      </w:r>
+    </w:p>
+    <w:p>
+      <w:pPr>
+        <w:pStyle w:val="Heading2"/>
+      </w:pPr>
+      <w:r>
+        <w:t>4.1 Mapa de contatos por resíduo</w:t>
+      </w:r>
+    </w:p>
+    <w:p>
+      <w:r>
+        <w:t>A frequência de contato (fração dos frames com distância mínima atômica &lt; 0,4 nm, mesmo critério de ANALYSES) foi calculada para cada par receptor–ligante. A His69 catalítica apresentou contato praticamente constante (frequência 0,945) com um resíduo específico do ligante (Val318), reforçando o papel de âncora principal já identificado pela análise de tríade. Um segundo agrupamento forte de contatos concentra-se na porção C-terminal do ligante (resíduos Ser329–Arg332, frequências entre 0,84 e 0,98) — a mesma região que já havia se destacado na análise de RMSF por maior mobilidade do C-terminal livre. Do lado do receptor, os contatos mais frequentes recaem sobre Ser232/Pro233 (0,96–1,00), Gly187 (0,96), Phe43 (0,98) e Arg210 (0,90), além da própria His69.</w:t>
+      </w:r>
+    </w:p>
+    <w:p>
+      <w:r>
+        <w:t>O ligante GORE12T revelou, nesta análise, uma arquitetura de repetição em tándem: a sequência alterna motivos curtos ricos em resíduos básicos (Val-Leu-Arg ou Val-Leu-Lys) com espaçadores flexíveis Gly-Gly-Ser, um padrão típico de linker multivalente. Os picos de contato concentram-se consistentemente nos resíduos Arg/Lys de cada motivo repetido (ex.: Arg260, Lys320, Arg332), não nos espaçadores — sugerindo que cada repetição contribui de forma semelhante ao reconhecimento, com engajamento eletrostático/H-bond dos resíduos básicos contra a superfície do receptor.</w:t>
+      </w:r>
+    </w:p>
+    <w:p>
+      <w:r>
+        <w:drawing>
+          <wp:inline xmlns:a="http://schemas.openxmlformats.org/drawingml/2006/main" xmlns:pic="http://schemas.openxmlformats.org/drawingml/2006/picture">
+            <wp:extent cx="2651760" cy="8330136"/>
+            <wp:docPr id="3" name="Picture 3"/>
+            <wp:cNvGraphicFramePr>
+              <a:graphicFrameLocks noChangeAspect="1"/>
+            </wp:cNvGraphicFramePr>
+            <a:graphic>
+              <a:graphicData uri="http://schemas.openxmlformats.org/drawingml/2006/picture">
+                <pic:pic>
+                  <pic:nvPicPr>
+                    <pic:cNvPr id="0" name="contact_map.png"/>
+                    <pic:cNvPicPr/>
+                  </pic:nvPicPr>
+                  <pic:blipFill>
+                    <a:blip r:embed="rId11"/>
+                    <a:stretch>
+                      <a:fillRect/>
+                    </a:stretch>
+                  </pic:blipFill>
+                  <pic:spPr>
+                    <a:xfrm>
+                      <a:off x="0" y="0"/>
+                      <a:ext cx="2651760" cy="8330136"/>
+                    </a:xfrm>
+                    <a:prstGeom prst="rect"/>
+                  </pic:spPr>
+                </pic:pic>
+              </a:graphicData>
+            </a:graphic>
+          </wp:inline>
+        </w:drawing>
+      </w:r>
+    </w:p>
+    <w:p>
+      <w:r>
+        <w:t>Figura 3. Mapa de frequência de contato receptor–ligante (numeração PDB). A resolução completa por resíduo está disponível no arquivo contact_map.png em alta resolução.</w:t>
+      </w:r>
+    </w:p>
+    <w:p>
+      <w:pPr>
+        <w:pStyle w:val="Heading2"/>
+      </w:pPr>
+      <w:r>
+        <w:t>4.2 Perfil farmacofórico da interface</w:t>
+      </w:r>
+    </w:p>
+    <w:p>
+      <w:r>
+        <w:t>Os resíduos de interface persistentes (frequência de contato ≥ 20% dos frames) foram classificados por tipo de feature farmacofórica (tabela fixa por tipo de resíduo, sem uso de RDKit — trata-se de uma interface peptídeo-peptídeo, não de molécula pequena). O perfil resultante é equilibrado entre os dois lados da interface: doadores de H predominam (14 resíduos do receptor, 11 do ligante), seguidos por aceptores de H (10 e 6, respectivamente) e resíduos hidrofóbicos (13 e 9). Resíduos aromáticos aparecem só do lado do receptor (6 resíduos — Phe43, Phe111, Trp81, Trp163, entre outros, confirmados também na análise de ProLIF abaixo), e resíduos ionizáveis são minoria em ambos os lados (5 positivos e até 2 negativos no receptor; 5 positivos e nenhum negativo no ligante — consistente com o ligante ser rico em Arg/Lys, não em Asp/Glu).</w:t>
+      </w:r>
+    </w:p>
+    <w:p>
+      <w:r>
+        <w:drawing>
+          <wp:inline xmlns:a="http://schemas.openxmlformats.org/drawingml/2006/main" xmlns:pic="http://schemas.openxmlformats.org/drawingml/2006/picture">
+            <wp:extent cx="5577840" cy="3058815"/>
+            <wp:docPr id="4" name="Picture 4"/>
+            <wp:cNvGraphicFramePr>
+              <a:graphicFrameLocks noChangeAspect="1"/>
+            </wp:cNvGraphicFramePr>
+            <a:graphic>
+              <a:graphicData uri="http://schemas.openxmlformats.org/drawingml/2006/picture">
+                <pic:pic>
+                  <pic:nvPicPr>
+                    <pic:cNvPr id="0" name="pharmacophore_summary.png"/>
+                    <pic:cNvPicPr/>
+                  </pic:nvPicPr>
+                  <pic:blipFill>
+                    <a:blip r:embed="rId12"/>
+                    <a:stretch>
+                      <a:fillRect/>
+                    </a:stretch>
+                  </pic:blipFill>
+                  <pic:spPr>
+                    <a:xfrm>
+                      <a:off x="0" y="0"/>
+                      <a:ext cx="5577840" cy="3058815"/>
+                    </a:xfrm>
+                    <a:prstGeom prst="rect"/>
+                  </pic:spPr>
+                </pic:pic>
+              </a:graphicData>
+            </a:graphic>
+          </wp:inline>
+        </w:drawing>
+      </w:r>
+    </w:p>
+    <w:p>
+      <w:r>
+        <w:t>Figura 4. Contagem de resíduos de interface por tipo de feature farmacofórica, separada por receptor e ligante.</w:t>
+      </w:r>
+    </w:p>
+    <w:p>
+      <w:pPr>
+        <w:pStyle w:val="Heading2"/>
+      </w:pPr>
+      <w:r>
+        <w:t>4.3 Fingerprint de interação (ProLIF)</w:t>
+      </w:r>
+    </w:p>
+    <w:p>
+      <w:r>
+        <w:t>O fingerprint de interação ProLIF (ligações de hidrogênio doadoras e aceptoras, contatos hidrofóbicos, empilhamento π, interações iônicas e contatos de van der Waals) foi calculado por frame para identificar o TIPO de interação predominante em cada resíduo, complementando a informação puramente distância-based do mapa de contatos. O Asp76 do receptor destacou-se com interação praticamente constante (contato de van der Waals e ligação de hidrogênio, ambos próximos de 1,0), coerente com seu alto contato observado na análise anterior. Phe43 e Phe111 mostraram forte contribuição hidrofóbica e de van der Waals (próximas de 1,0), identificando um componente de empacotamento aromático na interface que não havia sido destacado na análise de tríade original (que monitora apenas os quatro resíduos catalíticos). A His69 apresentou atividade combinada de ligação de hidrogênio e contato hidrofóbico, reforçando novamente seu papel central no reconhecimento.</w:t>
+      </w:r>
+    </w:p>
+    <w:p>
+      <w:r>
+        <w:drawing>
+          <wp:inline xmlns:a="http://schemas.openxmlformats.org/drawingml/2006/main" xmlns:pic="http://schemas.openxmlformats.org/drawingml/2006/picture">
+            <wp:extent cx="4572000" cy="6357998"/>
+            <wp:docPr id="5" name="Picture 5"/>
+            <wp:cNvGraphicFramePr>
+              <a:graphicFrameLocks noChangeAspect="1"/>
+            </wp:cNvGraphicFramePr>
+            <a:graphic>
+              <a:graphicData uri="http://schemas.openxmlformats.org/drawingml/2006/picture">
+                <pic:pic>
+                  <pic:nvPicPr>
+                    <pic:cNvPr id="0" name="prolif_heatmap.png"/>
+                    <pic:cNvPicPr/>
+                  </pic:nvPicPr>
+                  <pic:blipFill>
+                    <a:blip r:embed="rId13"/>
+                    <a:stretch>
+                      <a:fillRect/>
+                    </a:stretch>
+                  </pic:blipFill>
+                  <pic:spPr>
+                    <a:xfrm>
+                      <a:off x="0" y="0"/>
+                      <a:ext cx="4572000" cy="6357998"/>
+                    </a:xfrm>
+                    <a:prstGeom prst="rect"/>
+                  </pic:spPr>
+                </pic:pic>
+              </a:graphicData>
+            </a:graphic>
+          </wp:inline>
+        </w:drawing>
+      </w:r>
+    </w:p>
+    <w:p>
+      <w:r>
+        <w:t>Figura 5. Frequência de cada tipo de interação ProLIF por resíduo do receptor (numeração PDB).</w:t>
+      </w:r>
+    </w:p>
+    <w:p>
+      <w:pPr>
+        <w:pStyle w:val="Heading2"/>
+      </w:pPr>
+      <w:r>
+        <w:t>4.4 Estimativa de energia livre e Kd (aproximação sem solvatação)</w:t>
+      </w:r>
+    </w:p>
+    <w:p>
+      <w:r>
+        <w:t>Como alternativa ao MM-GBSA, a energia de interação Coulomb-SR + LJ-SR entre receptor e ligante foi recalculada via rerun do GROMACS com grupos de energia definidos (Receptor/Ligante), sobre a mesma subtrajetória reduzida preparada para o MM-GBSA (1167 frames). A correção entrópica foi obtida pelo método Interaction Entropy (Duan, Liu, Zhang, JACS 2016), calculada diretamente da flutuação dessa energia de interação — sem qualquer ferramenta adicional além do GROMACS nativo e numpy.</w:t>
+      </w:r>
+    </w:p>
+    <w:p>
+      <w:r>
+        <w:t>Resultado: ⟨ΔE_MM⟩ (Coulomb+LJ) = −942,4 ± 88,1 kJ/mol; −TΔS (Interaction Entropy) = +273,2 kJ/mol; ΔG estimado = −669,2 kJ/mol (−159,9 kcal/mol); Kd estimado ≈ 3,06×10⁻¹¹⁷ (unidade molar relativa). Esses valores são, como esperado, fisicamente exagerados: sem um termo de solvatação implícita (PB/GB) para cancelar a maior parte da eletrostática, a energia de interação em vácuo entre duas cadeias carregadas superestima brutalmente a afinidade — exatamente o motivo pelo qual o MM-GBSA/MM-PBSA de verdade inclui esse termo. O próprio script sinalizou instabilidade numérica do método (desvio padrão da energia de interação de 35,3 kT, acima do limiar de 10 kT recomendado na literatura). Esses números não devem ser citados como energia livre de ligação absoluta; seu único uso legítimo é como métrica de comparação relativa entre isoformas da série, calculadas pelo mesmo método, quando as demais isoformas forem processadas de forma equivalente.</w:t>
+      </w:r>
+    </w:p>
+    <w:p>
+      <w:r>
+        <w:drawing>
+          <wp:inline xmlns:a="http://schemas.openxmlformats.org/drawingml/2006/main" xmlns:pic="http://schemas.openxmlformats.org/drawingml/2006/picture">
+            <wp:extent cx="5577840" cy="3069487"/>
+            <wp:docPr id="6" name="Picture 6"/>
+            <wp:cNvGraphicFramePr>
+              <a:graphicFrameLocks noChangeAspect="1"/>
+            </wp:cNvGraphicFramePr>
+            <a:graphic>
+              <a:graphicData uri="http://schemas.openxmlformats.org/drawingml/2006/picture">
+                <pic:pic>
+                  <pic:nvPicPr>
+                    <pic:cNvPr id="0" name="interaction_energy.png"/>
+                    <pic:cNvPicPr/>
+                  </pic:nvPicPr>
+                  <pic:blipFill>
+                    <a:blip r:embed="rId14"/>
+                    <a:stretch>
+                      <a:fillRect/>
+                    </a:stretch>
+                  </pic:blipFill>
+                  <pic:spPr>
+                    <a:xfrm>
+                      <a:off x="0" y="0"/>
+                      <a:ext cx="5577840" cy="3069487"/>
+                    </a:xfrm>
+                    <a:prstGeom prst="rect"/>
+                  </pic:spPr>
+                </pic:pic>
+              </a:graphicData>
+            </a:graphic>
+          </wp:inline>
+        </w:drawing>
+      </w:r>
+    </w:p>
+    <w:p>
+      <w:r>
+        <w:t>Figura 6. Energia de interação Coulomb-SR + LJ-SR ao longo da subtrajetória usada na estimativa de energia livre.</w:t>
+      </w:r>
+    </w:p>
+    <w:p>
+      <w:pPr>
+        <w:pStyle w:val="Heading2"/>
+      </w:pPr>
+      <w:r>
+        <w:t>4.5 Síntese das análises adicionais</w:t>
+      </w:r>
+    </w:p>
+    <w:p>
+      <w:r>
+        <w:t>As quatro análises exploratórias convergem com o que já havia sido estabelecido pela análise de tríade catalítica e reforçam-no com detalhe adicional: a His69 permanece a âncora central do reconhecimento, agora confirmada por três métodos independentes (distância mínima, frequência de contato e fingerprint de interação). Duas contribuições novas emergem que não eram visíveis na análise original de quatro resíduos: um componente de empacotamento aromático via Phe43/Phe111, e uma arquitetura de repetição em tándem do próprio ligante GORE12T (motivos Val-Leu-Arg/Lys separados por linkers Gly-Gly-Ser), cujos resíduos básicos concentram a maior parte do contato com a superfície do receptor. A estimativa de energia livre, embora não utilizável como valor absoluto, já está pronta para servir de métrica relativa quando comparada às demais isoformas da série, assim que processadas pelo mesmo protocolo.</w:t>
       </w:r>
     </w:p>
     <w:sectPr>

</xml_diff>

<commit_message>
Fix RMSF ligand highlight: peptide GORE12T has 75 residues, not 5
plot_rmsf() hardcoded the ligand highlight to the last 5 residues,
inherited from the old GORE4 peptide (5 aa). GORE12T (used across the
whole DN773-DN2954 series) has 75 residues, so 70 of them were being
plotted as part of the receptor. Added --lig-len (default 75) and
regenerated all figures for the 5 existing analyses.

Also corrected the DN773 RMSF caption in docs/metodologia_resultados:
the "peak at residues 250-260" claim didn't match the real .xvg data
(that range is actually low-RMSF); the real receptor peak is at
~73-92, and the peptide shows elevated mobility at both termini
(258-267 and 322-328), not just the last 5 C-terminal residues.

Co-Authored-By: Claude Sonnet 5 <noreply@anthropic.com>
</commit_message>
<xml_diff>
--- a/docs/metodologia_resultados_DN773-GORE12T.docx
+++ b/docs/metodologia_resultados_DN773-GORE12T.docx
@@ -256,7 +256,7 @@
           <w:i w:val="0"/>
           <w:sz w:val="24"/>
         </w:rPr>
-        <w:t>O raio de giro do receptor apresentou tendência discreta de queda ao longo da simulação (de aproximadamente 1,86 nm em t = 0 para 1,80 nm em t = 100 ns; média global de 1,827 ± 0,022 nm), sugerindo leve compactação estrutural progressiva, sem sinais de desenovelamento ou expansão anômala. A análise de RMSF por resíduo revelou um pico pronunciado em torno dos resíduos 250–260 do receptor, compatível com um loop de superfície intrinsecamente flexível, e elevação moderada nos últimos cinco resíduos do ligante (C-terminal), indicando maior mobilidade da extremidade livre do peptídeo — padrão esperado para uma cadeia não totalmente restrita pela interface de ligação.</w:t>
+        <w:t>O raio de giro do receptor apresentou tendência discreta de queda ao longo da simulação (de aproximadamente 1,86 nm em t = 0 para 1,80 nm em t = 100 ns; média global de 1,827 ± 0,022 nm), sugerindo leve compactação estrutural progressiva, sem sinais de desenovelamento ou expansão anômala. A análise de RMSF por resíduo revelou que o pico de maior flutuação do receptor situa-se na região dos resíduos 73–92 (RMSF de até 0,34 nm), e não em torno de 250–260 como descrito anteriormente — essa faixa apresenta, na verdade, valores baixos (0,05–0,10 nm). No ligante GORE12T (75 resíduos), a mobilidade elevada não se restringe ao C-terminal: ambas as extremidades do peptídeo exibem RMSF alto — N-terminal (resíduos 258–267, pico de 0,445 nm no resíduo 258) e C-terminal (resíduos 322–328, pico de 0,543 nm no resíduo 326) — enquanto a porção central do peptídeo (resíduos ~278–320), mais inserida na interface de ligação, apresenta flutuação baixa (0,06–0,15 nm), padrão consistente com uma cadeia estendida ancorada pelo núcleo central e com as extremidades livres mais móveis.</w:t>
       </w:r>
     </w:p>
     <w:p>
@@ -1660,7 +1660,7 @@
     </w:p>
     <w:p>
       <w:r>
-        <w:t>A frequência de contato (fração dos frames com distância mínima atômica &lt; 0,4 nm, mesmo critério de ANALYSES) foi calculada para cada par receptor–ligante. A His69 catalítica apresentou contato praticamente constante (frequência 0,945) com um resíduo específico do ligante (Val318), reforçando o papel de âncora principal já identificado pela análise de tríade. Um segundo agrupamento forte de contatos concentra-se na porção C-terminal do ligante (resíduos Ser329–Arg332, frequências entre 0,84 e 0,98) — a mesma região que já havia se destacado na análise de RMSF por maior mobilidade do C-terminal livre. Do lado do receptor, os contatos mais frequentes recaem sobre Ser232/Pro233 (0,96–1,00), Gly187 (0,96), Phe43 (0,98) e Arg210 (0,90), além da própria His69.</w:t>
+        <w:t>A frequência de contato (fração dos frames com distância mínima atômica &lt; 0,4 nm, mesmo critério de ANALYSES) foi calculada para cada par receptor–ligante. A His69 catalítica apresentou contato praticamente constante (frequência 0,945) com um resíduo específico do ligante (Val318), reforçando o papel de âncora principal já identificado pela análise de tríade. Um segundo agrupamento forte de contatos concentra-se na porção C-terminal do ligante (resíduos Ser329–Arg332, frequências entre 0,84 e 0,98) — região contígua ao trecho C-terminal (resíduos 322–328) que já havia se destacado na análise de RMSF por maior mobilidade, embora, como visto, o N-terminal do peptídeo apresente mobilidade igualmente elevada. Do lado do receptor, os contatos mais frequentes recaem sobre Ser232/Pro233 (0,96–1,00), Gly187 (0,96), Phe43 (0,98) e Arg210 (0,90), além da própria His69.</w:t>
       </w:r>
     </w:p>
     <w:p>

</xml_diff>